<commit_message>
Personalize: Dr. Dhiaa as supervisor; team-only mentions; @iau emails
- Student emails switched to {student_id}@iau.edu.sa format
- All course instructors set to Dr. Dhiaa (course supervisor)
- All non-team personal names removed (replaced with generic placeholders
  like 'Demo Student' / 'Test Student' for screenshot scenarios)
- Report, presentation title slide, README, and test guide updated
- Both server binaries rebuilt with new seed data
- All 21 screenshots re-captured against the corrected database
</commit_message>
<xml_diff>
--- a/Report/CS516_Project_Report.docx
+++ b/Report/CS516_Project_Report.docx
@@ -110,7 +110,7 @@
           <w:color w:val="3A4A5F"/>
           <w:sz w:val="24"/>
         </w:rPr>
-        <w:t>Mrs. Sarah Alissa, CCSIT-IAU</w:t>
+        <w:t>Dr. Dhiaa, CCSIT-IAU</w:t>
         <w:br/>
       </w:r>
     </w:p>
@@ -2611,7 +2611,7 @@
           <w:i w:val="0"/>
           <w:sz w:val="22"/>
         </w:rPr>
-        <w:t>When the inputs are valid, the record is inserted and the list refreshes immediately. We added a fourth student (Sara Mohammed) below; notice that the sort order is preserved and the form clears so the next entry doesn’t accidentally inherit the old values:</w:t>
+        <w:t>When the inputs are valid, the record is inserted and the list refreshes immediately. We added a fourth student (a Demo Student placeholder) below; notice that the sort order is preserved and the form clears so the next entry doesn’t accidentally inherit the old values:</w:t>
       </w:r>
     </w:p>
     <w:p>
@@ -3071,11 +3071,11 @@
               <a:graphicData uri="http://schemas.openxmlformats.org/drawingml/2006/picture">
                 <pic:pic>
                   <pic:nvPicPr>
-                    <pic:cNvPr id="0" name="py_10_attendance_summary.png"/>
+                    <pic:cNvPr id="0" name="py_09_attendance_report.png"/>
                     <pic:cNvPicPr/>
                   </pic:nvPicPr>
                   <pic:blipFill>
-                    <a:blip r:embed="rId18"/>
+                    <a:blip r:embed="rId17"/>
                     <a:stretch>
                       <a:fillRect/>
                     </a:stretch>
@@ -3223,7 +3223,7 @@
                     <pic:cNvPicPr/>
                   </pic:nvPicPr>
                   <pic:blipFill>
-                    <a:blip r:embed="rId19"/>
+                    <a:blip r:embed="rId18"/>
                     <a:stretch>
                       <a:fillRect/>
                     </a:stretch>
@@ -3277,7 +3277,7 @@
                     <pic:cNvPicPr/>
                   </pic:nvPicPr>
                   <pic:blipFill>
-                    <a:blip r:embed="rId20"/>
+                    <a:blip r:embed="rId19"/>
                     <a:stretch>
                       <a:fillRect/>
                     </a:stretch>
@@ -3345,7 +3345,7 @@
       <w:r>
         <w:drawing>
           <wp:inline xmlns:a="http://schemas.openxmlformats.org/drawingml/2006/main" xmlns:pic="http://schemas.openxmlformats.org/drawingml/2006/picture">
-            <wp:extent cx="5486400" cy="2927904"/>
+            <wp:extent cx="5486400" cy="2863633"/>
             <wp:docPr id="13" name="Picture 13"/>
             <wp:cNvGraphicFramePr>
               <a:graphicFrameLocks noChangeAspect="1"/>
@@ -3358,7 +3358,7 @@
                     <pic:cNvPicPr/>
                   </pic:nvPicPr>
                   <pic:blipFill>
-                    <a:blip r:embed="rId21"/>
+                    <a:blip r:embed="rId20"/>
                     <a:stretch>
                       <a:fillRect/>
                     </a:stretch>
@@ -3366,7 +3366,7 @@
                   <pic:spPr>
                     <a:xfrm>
                       <a:off x="0" y="0"/>
-                      <a:ext cx="5486400" cy="2927904"/>
+                      <a:ext cx="5486400" cy="2863633"/>
                     </a:xfrm>
                     <a:prstGeom prst="rect"/>
                   </pic:spPr>
@@ -3422,6 +3422,70 @@
                 <pic:pic>
                   <pic:nvPicPr>
                     <pic:cNvPr id="0" name="cpp_04_students_add_error.png"/>
+                    <pic:cNvPicPr/>
+                  </pic:nvPicPr>
+                  <pic:blipFill>
+                    <a:blip r:embed="rId21"/>
+                    <a:stretch>
+                      <a:fillRect/>
+                    </a:stretch>
+                  </pic:blipFill>
+                  <pic:spPr>
+                    <a:xfrm>
+                      <a:off x="0" y="0"/>
+                      <a:ext cx="5486400" cy="2087880"/>
+                    </a:xfrm>
+                    <a:prstGeom prst="rect"/>
+                  </pic:spPr>
+                </pic:pic>
+              </a:graphicData>
+            </a:graphic>
+          </wp:inline>
+        </w:drawing>
+      </w:r>
+    </w:p>
+    <w:p>
+      <w:pPr>
+        <w:spacing w:after="160"/>
+        <w:jc w:val="center"/>
+      </w:pPr>
+      <w:r>
+        <w:rPr>
+          <w:b w:val="0"/>
+          <w:i/>
+          <w:color w:val="5F6B7C"/>
+          <w:sz w:val="18"/>
+        </w:rPr>
+        <w:t>Figure 14. C++ client — Add student rejected (bad ID).</w:t>
+      </w:r>
+    </w:p>
+    <w:p>
+      <w:r>
+        <w:rPr>
+          <w:b w:val="0"/>
+          <w:i w:val="0"/>
+          <w:sz w:val="22"/>
+        </w:rPr>
+        <w:t>And the happy path:</w:t>
+      </w:r>
+    </w:p>
+    <w:p>
+      <w:pPr>
+        <w:jc w:val="center"/>
+      </w:pPr>
+      <w:r>
+        <w:drawing>
+          <wp:inline xmlns:a="http://schemas.openxmlformats.org/drawingml/2006/main" xmlns:pic="http://schemas.openxmlformats.org/drawingml/2006/picture">
+            <wp:extent cx="5486400" cy="2087880"/>
+            <wp:docPr id="15" name="Picture 15"/>
+            <wp:cNvGraphicFramePr>
+              <a:graphicFrameLocks noChangeAspect="1"/>
+            </wp:cNvGraphicFramePr>
+            <a:graphic>
+              <a:graphicData uri="http://schemas.openxmlformats.org/drawingml/2006/picture">
+                <pic:pic>
+                  <pic:nvPicPr>
+                    <pic:cNvPr id="0" name="cpp_05_students_add_ok.png"/>
                     <pic:cNvPicPr/>
                   </pic:nvPicPr>
                   <pic:blipFill>
@@ -3456,70 +3520,6 @@
           <w:color w:val="5F6B7C"/>
           <w:sz w:val="18"/>
         </w:rPr>
-        <w:t>Figure 14. C++ client — Add student rejected (bad ID).</w:t>
-      </w:r>
-    </w:p>
-    <w:p>
-      <w:r>
-        <w:rPr>
-          <w:b w:val="0"/>
-          <w:i w:val="0"/>
-          <w:sz w:val="22"/>
-        </w:rPr>
-        <w:t>And the happy path:</w:t>
-      </w:r>
-    </w:p>
-    <w:p>
-      <w:pPr>
-        <w:jc w:val="center"/>
-      </w:pPr>
-      <w:r>
-        <w:drawing>
-          <wp:inline xmlns:a="http://schemas.openxmlformats.org/drawingml/2006/main" xmlns:pic="http://schemas.openxmlformats.org/drawingml/2006/picture">
-            <wp:extent cx="5486400" cy="2087880"/>
-            <wp:docPr id="15" name="Picture 15"/>
-            <wp:cNvGraphicFramePr>
-              <a:graphicFrameLocks noChangeAspect="1"/>
-            </wp:cNvGraphicFramePr>
-            <a:graphic>
-              <a:graphicData uri="http://schemas.openxmlformats.org/drawingml/2006/picture">
-                <pic:pic>
-                  <pic:nvPicPr>
-                    <pic:cNvPr id="0" name="cpp_05_students_add_ok.png"/>
-                    <pic:cNvPicPr/>
-                  </pic:nvPicPr>
-                  <pic:blipFill>
-                    <a:blip r:embed="rId23"/>
-                    <a:stretch>
-                      <a:fillRect/>
-                    </a:stretch>
-                  </pic:blipFill>
-                  <pic:spPr>
-                    <a:xfrm>
-                      <a:off x="0" y="0"/>
-                      <a:ext cx="5486400" cy="2087880"/>
-                    </a:xfrm>
-                    <a:prstGeom prst="rect"/>
-                  </pic:spPr>
-                </pic:pic>
-              </a:graphicData>
-            </a:graphic>
-          </wp:inline>
-        </w:drawing>
-      </w:r>
-    </w:p>
-    <w:p>
-      <w:pPr>
-        <w:spacing w:after="160"/>
-        <w:jc w:val="center"/>
-      </w:pPr>
-      <w:r>
-        <w:rPr>
-          <w:b w:val="0"/>
-          <w:i/>
-          <w:color w:val="5F6B7C"/>
-          <w:sz w:val="18"/>
-        </w:rPr>
         <w:t>Figure 15. C++ client — Add student success.</w:t>
       </w:r>
     </w:p>
@@ -3567,7 +3567,7 @@
                     <pic:cNvPicPr/>
                   </pic:nvPicPr>
                   <pic:blipFill>
-                    <a:blip r:embed="rId24"/>
+                    <a:blip r:embed="rId23"/>
                     <a:stretch>
                       <a:fillRect/>
                     </a:stretch>
@@ -3648,7 +3648,7 @@
                     <pic:cNvPicPr/>
                   </pic:nvPicPr>
                   <pic:blipFill>
-                    <a:blip r:embed="rId25"/>
+                    <a:blip r:embed="rId24"/>
                     <a:stretch>
                       <a:fillRect/>
                     </a:stretch>
@@ -3702,7 +3702,7 @@
                     <pic:cNvPicPr/>
                   </pic:nvPicPr>
                   <pic:blipFill>
-                    <a:blip r:embed="rId26"/>
+                    <a:blip r:embed="rId25"/>
                     <a:stretch>
                       <a:fillRect/>
                     </a:stretch>
@@ -3783,7 +3783,7 @@
                     <pic:cNvPicPr/>
                   </pic:nvPicPr>
                   <pic:blipFill>
-                    <a:blip r:embed="rId27"/>
+                    <a:blip r:embed="rId26"/>
                     <a:stretch>
                       <a:fillRect/>
                     </a:stretch>
@@ -3837,7 +3837,7 @@
                     <pic:cNvPicPr/>
                   </pic:nvPicPr>
                   <pic:blipFill>
-                    <a:blip r:embed="rId28"/>
+                    <a:blip r:embed="rId27"/>
                     <a:stretch>
                       <a:fillRect/>
                     </a:stretch>
@@ -3904,7 +3904,7 @@
                     <pic:cNvPicPr/>
                   </pic:nvPicPr>
                   <pic:blipFill>
-                    <a:blip r:embed="rId29"/>
+                    <a:blip r:embed="rId28"/>
                     <a:stretch>
                       <a:fillRect/>
                     </a:stretch>

</xml_diff>